<commit_message>
fix: lab3 lab 4
</commit_message>
<xml_diff>
--- a/lab3/Звіт лаб 3.docx
+++ b/lab3/Звіт лаб 3.docx
@@ -1857,7 +1857,6 @@
           <w:rFonts w:ascii="Times New Roman" w:hAnsi="Times New Roman" w:cs="Times New Roman"/>
           <w:sz w:val="20"/>
           <w:szCs w:val="20"/>
-          <w:lang w:val="uk-UA"/>
         </w:rPr>
       </w:pPr>
       <w:proofErr w:type="spellStart"/>
@@ -2325,6 +2324,24 @@
           <w:rFonts w:ascii="Times New Roman" w:hAnsi="Times New Roman" w:cs="Times New Roman"/>
           <w:sz w:val="20"/>
           <w:szCs w:val="20"/>
+        </w:rPr>
+        <w:t xml:space="preserve">, </w:t>
+      </w:r>
+      <w:proofErr w:type="spellStart"/>
+      <w:r>
+        <w:rPr>
+          <w:rFonts w:ascii="Times New Roman" w:hAnsi="Times New Roman" w:cs="Times New Roman"/>
+          <w:sz w:val="20"/>
+          <w:szCs w:val="20"/>
+        </w:rPr>
+        <w:t>QIcon</w:t>
+      </w:r>
+      <w:proofErr w:type="spellEnd"/>
+      <w:r>
+        <w:rPr>
+          <w:rFonts w:ascii="Times New Roman" w:hAnsi="Times New Roman" w:cs="Times New Roman"/>
+          <w:sz w:val="20"/>
+          <w:szCs w:val="20"/>
           <w:lang w:val="uk-UA"/>
         </w:rPr>
         <w:br/>
@@ -7358,6 +7375,340 @@
         <w:br/>
         <w:t xml:space="preserve">        )</w:t>
       </w:r>
+    </w:p>
+    <w:p>
+      <w:pPr>
+        <w:spacing w:before="57" w:after="217" w:line="202" w:lineRule="exact"/>
+        <w:ind w:left="405"/>
+        <w:rPr>
+          <w:rFonts w:ascii="Times New Roman" w:hAnsi="Times New Roman" w:cs="Times New Roman"/>
+          <w:szCs w:val="20"/>
+          <w:lang w:val="uk-UA"/>
+        </w:rPr>
+      </w:pPr>
+      <w:proofErr w:type="spellStart"/>
+      <w:r>
+        <w:rPr>
+          <w:rFonts w:ascii="Times New Roman" w:hAnsi="Times New Roman" w:cs="Times New Roman"/>
+          <w:szCs w:val="20"/>
+          <w:lang w:val="uk-UA"/>
+        </w:rPr>
+        <w:t>self.point_action.setIcon</w:t>
+      </w:r>
+      <w:proofErr w:type="spellEnd"/>
+      <w:r>
+        <w:rPr>
+          <w:rFonts w:ascii="Times New Roman" w:hAnsi="Times New Roman" w:cs="Times New Roman"/>
+          <w:szCs w:val="20"/>
+          <w:lang w:val="uk-UA"/>
+        </w:rPr>
+        <w:t>(</w:t>
+      </w:r>
+      <w:proofErr w:type="spellStart"/>
+      <w:r>
+        <w:rPr>
+          <w:rFonts w:ascii="Times New Roman" w:hAnsi="Times New Roman" w:cs="Times New Roman"/>
+          <w:szCs w:val="20"/>
+          <w:lang w:val="uk-UA"/>
+        </w:rPr>
+        <w:t>QIcon</w:t>
+      </w:r>
+      <w:proofErr w:type="spellEnd"/>
+      <w:r>
+        <w:rPr>
+          <w:rFonts w:ascii="Times New Roman" w:hAnsi="Times New Roman" w:cs="Times New Roman"/>
+          <w:szCs w:val="20"/>
+          <w:lang w:val="uk-UA"/>
+        </w:rPr>
+        <w:t>("../</w:t>
+      </w:r>
+      <w:proofErr w:type="spellStart"/>
+      <w:r>
+        <w:rPr>
+          <w:rFonts w:ascii="Times New Roman" w:hAnsi="Times New Roman" w:cs="Times New Roman"/>
+          <w:szCs w:val="20"/>
+          <w:lang w:val="uk-UA"/>
+        </w:rPr>
+        <w:t>icons</w:t>
+      </w:r>
+      <w:proofErr w:type="spellEnd"/>
+      <w:r>
+        <w:rPr>
+          <w:rFonts w:ascii="Times New Roman" w:hAnsi="Times New Roman" w:cs="Times New Roman"/>
+          <w:szCs w:val="20"/>
+          <w:lang w:val="uk-UA"/>
+        </w:rPr>
+        <w:t>/</w:t>
+      </w:r>
+      <w:proofErr w:type="spellStart"/>
+      <w:r>
+        <w:rPr>
+          <w:rFonts w:ascii="Times New Roman" w:hAnsi="Times New Roman" w:cs="Times New Roman"/>
+          <w:szCs w:val="20"/>
+          <w:lang w:val="uk-UA"/>
+        </w:rPr>
+        <w:t>pencil.svg</w:t>
+      </w:r>
+      <w:proofErr w:type="spellEnd"/>
+      <w:r>
+        <w:rPr>
+          <w:rFonts w:ascii="Times New Roman" w:hAnsi="Times New Roman" w:cs="Times New Roman"/>
+          <w:szCs w:val="20"/>
+          <w:lang w:val="uk-UA"/>
+        </w:rPr>
+        <w:t>"))</w:t>
+      </w:r>
+      <w:r>
+        <w:rPr>
+          <w:rFonts w:ascii="Times New Roman" w:hAnsi="Times New Roman" w:cs="Times New Roman"/>
+          <w:szCs w:val="20"/>
+          <w:lang w:val="uk-UA"/>
+        </w:rPr>
+        <w:br/>
+      </w:r>
+      <w:proofErr w:type="spellStart"/>
+      <w:r>
+        <w:rPr>
+          <w:rFonts w:ascii="Times New Roman" w:hAnsi="Times New Roman" w:cs="Times New Roman"/>
+          <w:szCs w:val="20"/>
+          <w:lang w:val="uk-UA"/>
+        </w:rPr>
+        <w:t>self.line_action.setIcon</w:t>
+      </w:r>
+      <w:proofErr w:type="spellEnd"/>
+      <w:r>
+        <w:rPr>
+          <w:rFonts w:ascii="Times New Roman" w:hAnsi="Times New Roman" w:cs="Times New Roman"/>
+          <w:szCs w:val="20"/>
+          <w:lang w:val="uk-UA"/>
+        </w:rPr>
+        <w:t>(</w:t>
+      </w:r>
+      <w:proofErr w:type="spellStart"/>
+      <w:r>
+        <w:rPr>
+          <w:rFonts w:ascii="Times New Roman" w:hAnsi="Times New Roman" w:cs="Times New Roman"/>
+          <w:szCs w:val="20"/>
+          <w:lang w:val="uk-UA"/>
+        </w:rPr>
+        <w:t>QIcon</w:t>
+      </w:r>
+      <w:proofErr w:type="spellEnd"/>
+      <w:r>
+        <w:rPr>
+          <w:rFonts w:ascii="Times New Roman" w:hAnsi="Times New Roman" w:cs="Times New Roman"/>
+          <w:szCs w:val="20"/>
+          <w:lang w:val="uk-UA"/>
+        </w:rPr>
+        <w:t>("../</w:t>
+      </w:r>
+      <w:proofErr w:type="spellStart"/>
+      <w:r>
+        <w:rPr>
+          <w:rFonts w:ascii="Times New Roman" w:hAnsi="Times New Roman" w:cs="Times New Roman"/>
+          <w:szCs w:val="20"/>
+          <w:lang w:val="uk-UA"/>
+        </w:rPr>
+        <w:t>icons</w:t>
+      </w:r>
+      <w:proofErr w:type="spellEnd"/>
+      <w:r>
+        <w:rPr>
+          <w:rFonts w:ascii="Times New Roman" w:hAnsi="Times New Roman" w:cs="Times New Roman"/>
+          <w:szCs w:val="20"/>
+          <w:lang w:val="uk-UA"/>
+        </w:rPr>
+        <w:t>/</w:t>
+      </w:r>
+      <w:proofErr w:type="spellStart"/>
+      <w:r>
+        <w:rPr>
+          <w:rFonts w:ascii="Times New Roman" w:hAnsi="Times New Roman" w:cs="Times New Roman"/>
+          <w:szCs w:val="20"/>
+          <w:lang w:val="uk-UA"/>
+        </w:rPr>
+        <w:t>minus.svg</w:t>
+      </w:r>
+      <w:proofErr w:type="spellEnd"/>
+      <w:r>
+        <w:rPr>
+          <w:rFonts w:ascii="Times New Roman" w:hAnsi="Times New Roman" w:cs="Times New Roman"/>
+          <w:szCs w:val="20"/>
+          <w:lang w:val="uk-UA"/>
+        </w:rPr>
+        <w:t>"))</w:t>
+      </w:r>
+      <w:r>
+        <w:rPr>
+          <w:rFonts w:ascii="Times New Roman" w:hAnsi="Times New Roman" w:cs="Times New Roman"/>
+          <w:szCs w:val="20"/>
+          <w:lang w:val="uk-UA"/>
+        </w:rPr>
+        <w:br/>
+      </w:r>
+      <w:proofErr w:type="spellStart"/>
+      <w:r>
+        <w:rPr>
+          <w:rFonts w:ascii="Times New Roman" w:hAnsi="Times New Roman" w:cs="Times New Roman"/>
+          <w:szCs w:val="20"/>
+          <w:lang w:val="uk-UA"/>
+        </w:rPr>
+        <w:t>self.rectangle_action.setIcon</w:t>
+      </w:r>
+      <w:proofErr w:type="spellEnd"/>
+      <w:r>
+        <w:rPr>
+          <w:rFonts w:ascii="Times New Roman" w:hAnsi="Times New Roman" w:cs="Times New Roman"/>
+          <w:szCs w:val="20"/>
+          <w:lang w:val="uk-UA"/>
+        </w:rPr>
+        <w:t>(</w:t>
+      </w:r>
+      <w:proofErr w:type="spellStart"/>
+      <w:r>
+        <w:rPr>
+          <w:rFonts w:ascii="Times New Roman" w:hAnsi="Times New Roman" w:cs="Times New Roman"/>
+          <w:szCs w:val="20"/>
+          <w:lang w:val="uk-UA"/>
+        </w:rPr>
+        <w:t>QIcon</w:t>
+      </w:r>
+      <w:proofErr w:type="spellEnd"/>
+      <w:r>
+        <w:rPr>
+          <w:rFonts w:ascii="Times New Roman" w:hAnsi="Times New Roman" w:cs="Times New Roman"/>
+          <w:szCs w:val="20"/>
+          <w:lang w:val="uk-UA"/>
+        </w:rPr>
+        <w:t>("../</w:t>
+      </w:r>
+      <w:proofErr w:type="spellStart"/>
+      <w:r>
+        <w:rPr>
+          <w:rFonts w:ascii="Times New Roman" w:hAnsi="Times New Roman" w:cs="Times New Roman"/>
+          <w:szCs w:val="20"/>
+          <w:lang w:val="uk-UA"/>
+        </w:rPr>
+        <w:t>icons</w:t>
+      </w:r>
+      <w:proofErr w:type="spellEnd"/>
+      <w:r>
+        <w:rPr>
+          <w:rFonts w:ascii="Times New Roman" w:hAnsi="Times New Roman" w:cs="Times New Roman"/>
+          <w:szCs w:val="20"/>
+          <w:lang w:val="uk-UA"/>
+        </w:rPr>
+        <w:t>/</w:t>
+      </w:r>
+      <w:proofErr w:type="spellStart"/>
+      <w:r>
+        <w:rPr>
+          <w:rFonts w:ascii="Times New Roman" w:hAnsi="Times New Roman" w:cs="Times New Roman"/>
+          <w:szCs w:val="20"/>
+          <w:lang w:val="uk-UA"/>
+        </w:rPr>
+        <w:t>rectangle.svg</w:t>
+      </w:r>
+      <w:proofErr w:type="spellEnd"/>
+      <w:r>
+        <w:rPr>
+          <w:rFonts w:ascii="Times New Roman" w:hAnsi="Times New Roman" w:cs="Times New Roman"/>
+          <w:szCs w:val="20"/>
+          <w:lang w:val="uk-UA"/>
+        </w:rPr>
+        <w:t>"))</w:t>
+      </w:r>
+      <w:r>
+        <w:rPr>
+          <w:rFonts w:ascii="Times New Roman" w:hAnsi="Times New Roman" w:cs="Times New Roman"/>
+          <w:szCs w:val="20"/>
+          <w:lang w:val="uk-UA"/>
+        </w:rPr>
+        <w:br/>
+      </w:r>
+      <w:proofErr w:type="spellStart"/>
+      <w:r>
+        <w:rPr>
+          <w:rFonts w:ascii="Times New Roman" w:hAnsi="Times New Roman" w:cs="Times New Roman"/>
+          <w:szCs w:val="20"/>
+          <w:lang w:val="uk-UA"/>
+        </w:rPr>
+        <w:t>self.ellipse_action.setIcon</w:t>
+      </w:r>
+      <w:proofErr w:type="spellEnd"/>
+      <w:r>
+        <w:rPr>
+          <w:rFonts w:ascii="Times New Roman" w:hAnsi="Times New Roman" w:cs="Times New Roman"/>
+          <w:szCs w:val="20"/>
+          <w:lang w:val="uk-UA"/>
+        </w:rPr>
+        <w:t>(</w:t>
+      </w:r>
+      <w:proofErr w:type="spellStart"/>
+      <w:r>
+        <w:rPr>
+          <w:rFonts w:ascii="Times New Roman" w:hAnsi="Times New Roman" w:cs="Times New Roman"/>
+          <w:szCs w:val="20"/>
+          <w:lang w:val="uk-UA"/>
+        </w:rPr>
+        <w:t>QIcon</w:t>
+      </w:r>
+      <w:proofErr w:type="spellEnd"/>
+      <w:r>
+        <w:rPr>
+          <w:rFonts w:ascii="Times New Roman" w:hAnsi="Times New Roman" w:cs="Times New Roman"/>
+          <w:szCs w:val="20"/>
+          <w:lang w:val="uk-UA"/>
+        </w:rPr>
+        <w:t>("../</w:t>
+      </w:r>
+      <w:proofErr w:type="spellStart"/>
+      <w:r>
+        <w:rPr>
+          <w:rFonts w:ascii="Times New Roman" w:hAnsi="Times New Roman" w:cs="Times New Roman"/>
+          <w:szCs w:val="20"/>
+          <w:lang w:val="uk-UA"/>
+        </w:rPr>
+        <w:t>icons</w:t>
+      </w:r>
+      <w:proofErr w:type="spellEnd"/>
+      <w:r>
+        <w:rPr>
+          <w:rFonts w:ascii="Times New Roman" w:hAnsi="Times New Roman" w:cs="Times New Roman"/>
+          <w:szCs w:val="20"/>
+          <w:lang w:val="uk-UA"/>
+        </w:rPr>
+        <w:t>/</w:t>
+      </w:r>
+      <w:proofErr w:type="spellStart"/>
+      <w:r>
+        <w:rPr>
+          <w:rFonts w:ascii="Times New Roman" w:hAnsi="Times New Roman" w:cs="Times New Roman"/>
+          <w:szCs w:val="20"/>
+          <w:lang w:val="uk-UA"/>
+        </w:rPr>
+        <w:t>ellipse.svg</w:t>
+      </w:r>
+      <w:proofErr w:type="spellEnd"/>
+      <w:r>
+        <w:rPr>
+          <w:rFonts w:ascii="Times New Roman" w:hAnsi="Times New Roman" w:cs="Times New Roman"/>
+          <w:szCs w:val="20"/>
+          <w:lang w:val="uk-UA"/>
+        </w:rPr>
+        <w:t>"))</w:t>
+      </w:r>
+    </w:p>
+    <w:p>
+      <w:pPr>
+        <w:spacing w:before="57" w:after="217" w:line="202" w:lineRule="exact"/>
+        <w:rPr>
+          <w:rFonts w:ascii="Times New Roman" w:hAnsi="Times New Roman" w:cs="Times New Roman"/>
+          <w:sz w:val="20"/>
+          <w:szCs w:val="20"/>
+          <w:lang w:val="uk-UA"/>
+        </w:rPr>
+      </w:pPr>
       <w:r>
         <w:rPr>
           <w:rFonts w:ascii="Times New Roman" w:hAnsi="Times New Roman" w:cs="Times New Roman"/>
@@ -7503,7 +7854,6 @@
           <w:szCs w:val="20"/>
           <w:lang w:val="uk-UA"/>
         </w:rPr>
-        <w:lastRenderedPageBreak/>
         <w:br/>
         <w:t xml:space="preserve">        </w:t>
       </w:r>
@@ -9846,14 +10196,6 @@
           <w:lang w:val="uk-UA"/>
         </w:rPr>
         <w:br/>
-      </w:r>
-      <w:r>
-        <w:rPr>
-          <w:rFonts w:ascii="Times New Roman" w:hAnsi="Times New Roman" w:cs="Times New Roman"/>
-          <w:szCs w:val="22"/>
-          <w:lang w:val="uk-UA"/>
-        </w:rPr>
-        <w:lastRenderedPageBreak/>
         <w:t xml:space="preserve">        </w:t>
       </w:r>
       <w:proofErr w:type="spellStart"/>
@@ -12845,14 +13187,6 @@
           <w:lang w:val="uk-UA"/>
         </w:rPr>
         <w:br/>
-      </w:r>
-      <w:r>
-        <w:rPr>
-          <w:rFonts w:ascii="Times New Roman" w:hAnsi="Times New Roman" w:cs="Times New Roman"/>
-          <w:szCs w:val="22"/>
-          <w:lang w:val="uk-UA"/>
-        </w:rPr>
-        <w:lastRenderedPageBreak/>
         <w:t xml:space="preserve">        </w:t>
       </w:r>
       <w:proofErr w:type="spellStart"/>
@@ -16415,7 +16749,6 @@
           <w:szCs w:val="22"/>
           <w:lang w:val="uk-UA"/>
         </w:rPr>
-        <w:lastRenderedPageBreak/>
         <w:t>class</w:t>
       </w:r>
       <w:proofErr w:type="spellEnd"/>
@@ -18429,48 +18762,6 @@
             <wp:extent cx="2905125" cy="2277854"/>
             <wp:effectExtent l="0" t="0" r="0" b="8255"/>
             <wp:docPr id="1" name="Рисунок 1"/>
-            <wp:cNvGraphicFramePr>
-              <a:graphicFrameLocks xmlns:a="http://schemas.openxmlformats.org/drawingml/2006/main" noChangeAspect="1"/>
-            </wp:cNvGraphicFramePr>
-            <a:graphic xmlns:a="http://schemas.openxmlformats.org/drawingml/2006/main">
-              <a:graphicData uri="http://schemas.openxmlformats.org/drawingml/2006/picture">
-                <pic:pic xmlns:pic="http://schemas.openxmlformats.org/drawingml/2006/picture">
-                  <pic:nvPicPr>
-                    <pic:cNvPr id="1" name=""/>
-                    <pic:cNvPicPr/>
-                  </pic:nvPicPr>
-                  <pic:blipFill>
-                    <a:blip r:embed="rId4"/>
-                    <a:stretch>
-                      <a:fillRect/>
-                    </a:stretch>
-                  </pic:blipFill>
-                  <pic:spPr>
-                    <a:xfrm>
-                      <a:off x="0" y="0"/>
-                      <a:ext cx="2912321" cy="2283496"/>
-                    </a:xfrm>
-                    <a:prstGeom prst="rect">
-                      <a:avLst/>
-                    </a:prstGeom>
-                  </pic:spPr>
-                </pic:pic>
-              </a:graphicData>
-            </a:graphic>
-          </wp:inline>
-        </w:drawing>
-      </w:r>
-      <w:r>
-        <w:rPr>
-          <w:rFonts w:ascii="Times New Roman" w:hAnsi="Times New Roman" w:cs="Times New Roman"/>
-          <w:noProof/>
-          <w:lang w:val="uk-UA"/>
-        </w:rPr>
-        <w:drawing>
-          <wp:inline distT="0" distB="0" distL="0" distR="0" wp14:anchorId="062B686C" wp14:editId="452456BA">
-            <wp:extent cx="2953936" cy="2310130"/>
-            <wp:effectExtent l="0" t="0" r="0" b="0"/>
-            <wp:docPr id="2" name="Рисунок 2"/>
             <wp:cNvGraphicFramePr>
               <a:graphicFrameLocks xmlns:a="http://schemas.openxmlformats.org/drawingml/2006/main" noChangeAspect="1"/>
             </wp:cNvGraphicFramePr>
@@ -18490,7 +18781,7 @@
                   <pic:spPr>
                     <a:xfrm>
                       <a:off x="0" y="0"/>
-                      <a:ext cx="2960883" cy="2315563"/>
+                      <a:ext cx="2912321" cy="2283496"/>
                     </a:xfrm>
                     <a:prstGeom prst="rect">
                       <a:avLst/>
@@ -18508,12 +18799,11 @@
           <w:noProof/>
           <w:lang w:val="uk-UA"/>
         </w:rPr>
-        <w:lastRenderedPageBreak/>
         <w:drawing>
-          <wp:inline distT="0" distB="0" distL="0" distR="0" wp14:anchorId="7E7D4DB2" wp14:editId="3D766453">
-            <wp:extent cx="2914650" cy="2303385"/>
-            <wp:effectExtent l="0" t="0" r="0" b="1905"/>
-            <wp:docPr id="3" name="Рисунок 3"/>
+          <wp:inline distT="0" distB="0" distL="0" distR="0" wp14:anchorId="062B686C" wp14:editId="452456BA">
+            <wp:extent cx="2953936" cy="2310130"/>
+            <wp:effectExtent l="0" t="0" r="0" b="0"/>
+            <wp:docPr id="2" name="Рисунок 2"/>
             <wp:cNvGraphicFramePr>
               <a:graphicFrameLocks xmlns:a="http://schemas.openxmlformats.org/drawingml/2006/main" noChangeAspect="1"/>
             </wp:cNvGraphicFramePr>
@@ -18533,7 +18823,7 @@
                   <pic:spPr>
                     <a:xfrm>
                       <a:off x="0" y="0"/>
-                      <a:ext cx="2923934" cy="2310722"/>
+                      <a:ext cx="2960883" cy="2315563"/>
                     </a:xfrm>
                     <a:prstGeom prst="rect">
                       <a:avLst/>
@@ -18552,10 +18842,10 @@
           <w:lang w:val="uk-UA"/>
         </w:rPr>
         <w:drawing>
-          <wp:inline distT="0" distB="0" distL="0" distR="0" wp14:anchorId="7505E9F3" wp14:editId="05B0AF0E">
-            <wp:extent cx="2938436" cy="2292985"/>
-            <wp:effectExtent l="0" t="0" r="0" b="0"/>
-            <wp:docPr id="4" name="Рисунок 4"/>
+          <wp:inline distT="0" distB="0" distL="0" distR="0" wp14:anchorId="7E7D4DB2" wp14:editId="3D766453">
+            <wp:extent cx="2914650" cy="2303385"/>
+            <wp:effectExtent l="0" t="0" r="0" b="1905"/>
+            <wp:docPr id="3" name="Рисунок 3"/>
             <wp:cNvGraphicFramePr>
               <a:graphicFrameLocks xmlns:a="http://schemas.openxmlformats.org/drawingml/2006/main" noChangeAspect="1"/>
             </wp:cNvGraphicFramePr>
@@ -18575,7 +18865,7 @@
                   <pic:spPr>
                     <a:xfrm>
                       <a:off x="0" y="0"/>
-                      <a:ext cx="2947060" cy="2299715"/>
+                      <a:ext cx="2923934" cy="2310722"/>
                     </a:xfrm>
                     <a:prstGeom prst="rect">
                       <a:avLst/>
@@ -18594,10 +18884,10 @@
           <w:lang w:val="uk-UA"/>
         </w:rPr>
         <w:drawing>
-          <wp:inline distT="0" distB="0" distL="0" distR="0" wp14:anchorId="2A20C783" wp14:editId="6E648CCB">
-            <wp:extent cx="2943882" cy="2310130"/>
-            <wp:effectExtent l="0" t="0" r="8890" b="0"/>
-            <wp:docPr id="5" name="Рисунок 5"/>
+          <wp:inline distT="0" distB="0" distL="0" distR="0" wp14:anchorId="7505E9F3" wp14:editId="05B0AF0E">
+            <wp:extent cx="2938436" cy="2292985"/>
+            <wp:effectExtent l="0" t="0" r="0" b="0"/>
+            <wp:docPr id="4" name="Рисунок 4"/>
             <wp:cNvGraphicFramePr>
               <a:graphicFrameLocks xmlns:a="http://schemas.openxmlformats.org/drawingml/2006/main" noChangeAspect="1"/>
             </wp:cNvGraphicFramePr>
@@ -18617,7 +18907,7 @@
                   <pic:spPr>
                     <a:xfrm>
                       <a:off x="0" y="0"/>
-                      <a:ext cx="2959880" cy="2322684"/>
+                      <a:ext cx="2947060" cy="2299715"/>
                     </a:xfrm>
                     <a:prstGeom prst="rect">
                       <a:avLst/>
@@ -18636,10 +18926,10 @@
           <w:lang w:val="uk-UA"/>
         </w:rPr>
         <w:drawing>
-          <wp:inline distT="0" distB="0" distL="0" distR="0" wp14:anchorId="1A37D8A4" wp14:editId="21627FA3">
-            <wp:extent cx="2893190" cy="2266950"/>
-            <wp:effectExtent l="0" t="0" r="2540" b="0"/>
-            <wp:docPr id="6" name="Рисунок 6"/>
+          <wp:inline distT="0" distB="0" distL="0" distR="0" wp14:anchorId="2A20C783" wp14:editId="6E648CCB">
+            <wp:extent cx="2943882" cy="2310130"/>
+            <wp:effectExtent l="0" t="0" r="8890" b="0"/>
+            <wp:docPr id="5" name="Рисунок 5"/>
             <wp:cNvGraphicFramePr>
               <a:graphicFrameLocks xmlns:a="http://schemas.openxmlformats.org/drawingml/2006/main" noChangeAspect="1"/>
             </wp:cNvGraphicFramePr>
@@ -18659,7 +18949,7 @@
                   <pic:spPr>
                     <a:xfrm>
                       <a:off x="0" y="0"/>
-                      <a:ext cx="2902264" cy="2274060"/>
+                      <a:ext cx="2959880" cy="2322684"/>
                     </a:xfrm>
                     <a:prstGeom prst="rect">
                       <a:avLst/>
@@ -18671,65 +18961,17 @@
           </wp:inline>
         </w:drawing>
       </w:r>
-    </w:p>
-    <w:p>
-      <w:pPr>
-        <w:jc w:val="center"/>
-        <w:rPr>
+      <w:r>
+        <w:rPr>
+          <w:rFonts w:ascii="Times New Roman" w:hAnsi="Times New Roman" w:cs="Times New Roman"/>
           <w:noProof/>
           <w:lang w:val="uk-UA"/>
         </w:rPr>
-      </w:pPr>
-    </w:p>
-    <w:p>
-      <w:pPr>
-        <w:rPr>
-          <w:rFonts w:ascii="Times New Roman" w:hAnsi="Times New Roman" w:cs="Times New Roman"/>
-          <w:b/>
-          <w:bCs/>
-          <w:noProof/>
-          <w:sz w:val="28"/>
-          <w:szCs w:val="28"/>
-          <w:lang w:val="uk-UA"/>
-        </w:rPr>
-      </w:pPr>
-      <w:r>
-        <w:rPr>
-          <w:rFonts w:ascii="Times New Roman" w:hAnsi="Times New Roman" w:cs="Times New Roman"/>
-          <w:b/>
-          <w:bCs/>
-          <w:noProof/>
-          <w:sz w:val="28"/>
-          <w:szCs w:val="28"/>
-          <w:lang w:val="uk-UA"/>
-        </w:rPr>
-        <w:t>Діаграма класів:</w:t>
-      </w:r>
-    </w:p>
-    <w:p>
-      <w:pPr>
-        <w:jc w:val="center"/>
-        <w:rPr>
-          <w:rFonts w:ascii="Times New Roman" w:hAnsi="Times New Roman" w:cs="Times New Roman"/>
-          <w:noProof/>
-          <w:sz w:val="28"/>
-          <w:szCs w:val="28"/>
-          <w:lang w:val="uk-UA"/>
-        </w:rPr>
-      </w:pPr>
-      <w:r>
-        <w:rPr>
-          <w:rFonts w:ascii="Times New Roman" w:hAnsi="Times New Roman" w:cs="Times New Roman"/>
-          <w:noProof/>
-          <w:sz w:val="28"/>
-          <w:szCs w:val="28"/>
-          <w:lang w:val="uk-UA"/>
-        </w:rPr>
         <w:drawing>
-          <wp:inline distT="0" distB="0" distL="0" distR="0" wp14:anchorId="5D32B6CB" wp14:editId="53235453">
-            <wp:extent cx="5943600" cy="3205480"/>
-            <wp:effectExtent l="0" t="0" r="0" b="0"/>
-            <wp:docPr id="7" name="Рисунок 7"/>
+          <wp:inline distT="0" distB="0" distL="0" distR="0" wp14:anchorId="1A37D8A4" wp14:editId="21627FA3">
+            <wp:extent cx="2893190" cy="2266950"/>
+            <wp:effectExtent l="0" t="0" r="2540" b="0"/>
+            <wp:docPr id="6" name="Рисунок 6"/>
             <wp:cNvGraphicFramePr>
               <a:graphicFrameLocks xmlns:a="http://schemas.openxmlformats.org/drawingml/2006/main" noChangeAspect="1"/>
             </wp:cNvGraphicFramePr>
@@ -18749,6 +18991,96 @@
                   <pic:spPr>
                     <a:xfrm>
                       <a:off x="0" y="0"/>
+                      <a:ext cx="2902264" cy="2274060"/>
+                    </a:xfrm>
+                    <a:prstGeom prst="rect">
+                      <a:avLst/>
+                    </a:prstGeom>
+                  </pic:spPr>
+                </pic:pic>
+              </a:graphicData>
+            </a:graphic>
+          </wp:inline>
+        </w:drawing>
+      </w:r>
+    </w:p>
+    <w:p>
+      <w:pPr>
+        <w:jc w:val="center"/>
+        <w:rPr>
+          <w:noProof/>
+          <w:lang w:val="uk-UA"/>
+        </w:rPr>
+      </w:pPr>
+    </w:p>
+    <w:p>
+      <w:pPr>
+        <w:rPr>
+          <w:rFonts w:ascii="Times New Roman" w:hAnsi="Times New Roman" w:cs="Times New Roman"/>
+          <w:b/>
+          <w:bCs/>
+          <w:noProof/>
+          <w:sz w:val="28"/>
+          <w:szCs w:val="28"/>
+          <w:lang w:val="uk-UA"/>
+        </w:rPr>
+      </w:pPr>
+      <w:r>
+        <w:rPr>
+          <w:rFonts w:ascii="Times New Roman" w:hAnsi="Times New Roman" w:cs="Times New Roman"/>
+          <w:b/>
+          <w:bCs/>
+          <w:noProof/>
+          <w:sz w:val="28"/>
+          <w:szCs w:val="28"/>
+          <w:lang w:val="uk-UA"/>
+        </w:rPr>
+        <w:t>Діаграма класів:</w:t>
+      </w:r>
+    </w:p>
+    <w:p>
+      <w:pPr>
+        <w:jc w:val="center"/>
+        <w:rPr>
+          <w:rFonts w:ascii="Times New Roman" w:hAnsi="Times New Roman" w:cs="Times New Roman"/>
+          <w:noProof/>
+          <w:sz w:val="28"/>
+          <w:szCs w:val="28"/>
+          <w:lang w:val="uk-UA"/>
+        </w:rPr>
+      </w:pPr>
+      <w:r>
+        <w:rPr>
+          <w:rFonts w:ascii="Times New Roman" w:hAnsi="Times New Roman" w:cs="Times New Roman"/>
+          <w:noProof/>
+          <w:sz w:val="28"/>
+          <w:szCs w:val="28"/>
+          <w:lang w:val="uk-UA"/>
+        </w:rPr>
+        <w:drawing>
+          <wp:inline distT="0" distB="0" distL="0" distR="0" wp14:anchorId="5D32B6CB" wp14:editId="53235453">
+            <wp:extent cx="5943600" cy="3205480"/>
+            <wp:effectExtent l="0" t="0" r="0" b="0"/>
+            <wp:docPr id="7" name="Рисунок 7"/>
+            <wp:cNvGraphicFramePr>
+              <a:graphicFrameLocks xmlns:a="http://schemas.openxmlformats.org/drawingml/2006/main" noChangeAspect="1"/>
+            </wp:cNvGraphicFramePr>
+            <a:graphic xmlns:a="http://schemas.openxmlformats.org/drawingml/2006/main">
+              <a:graphicData uri="http://schemas.openxmlformats.org/drawingml/2006/picture">
+                <pic:pic xmlns:pic="http://schemas.openxmlformats.org/drawingml/2006/picture">
+                  <pic:nvPicPr>
+                    <pic:cNvPr id="1" name=""/>
+                    <pic:cNvPicPr/>
+                  </pic:nvPicPr>
+                  <pic:blipFill>
+                    <a:blip r:embed="rId11"/>
+                    <a:stretch>
+                      <a:fillRect/>
+                    </a:stretch>
+                  </pic:blipFill>
+                  <pic:spPr>
+                    <a:xfrm>
+                      <a:off x="0" y="0"/>
                       <a:ext cx="5943600" cy="3205480"/>
                     </a:xfrm>
                     <a:prstGeom prst="rect">
@@ -18784,7 +19116,6 @@
           <w:szCs w:val="28"/>
           <w:lang w:val="uk-UA"/>
         </w:rPr>
-        <w:lastRenderedPageBreak/>
         <w:t>Висновки:</w:t>
       </w:r>
     </w:p>
@@ -19914,6 +20245,35 @@
       <w:spacing w:val="5"/>
     </w:rPr>
   </w:style>
+  <w:style w:type="paragraph" w:styleId="HTML">
+    <w:name w:val="HTML Preformatted"/>
+    <w:basedOn w:val="a"/>
+    <w:link w:val="HTML0"/>
+    <w:uiPriority w:val="99"/>
+    <w:semiHidden/>
+    <w:unhideWhenUsed/>
+    <w:rsid w:val="00C210FD"/>
+    <w:rPr>
+      <w:rFonts w:ascii="Consolas" w:hAnsi="Consolas" w:cs="Mangal"/>
+      <w:sz w:val="20"/>
+      <w:szCs w:val="18"/>
+    </w:rPr>
+  </w:style>
+  <w:style w:type="character" w:customStyle="1" w:styleId="HTML0">
+    <w:name w:val="Стандартний HTML Знак"/>
+    <w:basedOn w:val="a0"/>
+    <w:link w:val="HTML"/>
+    <w:uiPriority w:val="99"/>
+    <w:semiHidden/>
+    <w:rsid w:val="00C210FD"/>
+    <w:rPr>
+      <w:rFonts w:ascii="Consolas" w:eastAsia="Clear Sans" w:hAnsi="Consolas" w:cs="Mangal"/>
+      <w:kern w:val="2"/>
+      <w:sz w:val="20"/>
+      <w:szCs w:val="18"/>
+      <w:lang w:val="en-US" w:eastAsia="zh-CN" w:bidi="hi-IN"/>
+    </w:rPr>
+  </w:style>
 </w:styles>
 </file>
 
@@ -20210,4 +20570,16 @@
     </a:ext>
   </a:extLst>
 </a:theme>
+</file>
+
+<file path=customXml/item1.xml><?xml version="1.0" encoding="utf-8"?>
+<b:Sources xmlns:b="http://schemas.openxmlformats.org/officeDocument/2006/bibliography" xmlns="http://schemas.openxmlformats.org/officeDocument/2006/bibliography" SelectedStyle="\APASixthEditionOfficeOnline.xsl" StyleName="APA" Version="6"/>
+</file>
+
+<file path=customXml/itemProps1.xml><?xml version="1.0" encoding="utf-8"?>
+<ds:datastoreItem xmlns:ds="http://schemas.openxmlformats.org/officeDocument/2006/customXml" ds:itemID="{5E33F848-88F0-47FB-9B4E-284CDBB83293}">
+  <ds:schemaRefs>
+    <ds:schemaRef ds:uri="http://schemas.openxmlformats.org/officeDocument/2006/bibliography"/>
+  </ds:schemaRefs>
+</ds:datastoreItem>
 </file>
</xml_diff>